<commit_message>
Remove old files and update assignment
</commit_message>
<xml_diff>
--- a/assignment/Plan and contribution.docx
+++ b/assignment/Plan and contribution.docx
@@ -495,12 +495,6 @@
             <w:insideH w:val="single" w:color="auto" w:sz="4" w:space="0"/>
             <w:insideV w:val="single" w:color="auto" w:sz="4" w:space="0"/>
           </w:tblBorders>
-          <w:tblCellMar>
-            <w:top w:w="0" w:type="dxa"/>
-            <w:left w:w="108" w:type="dxa"/>
-            <w:bottom w:w="0" w:type="dxa"/>
-            <w:right w:w="108" w:type="dxa"/>
-          </w:tblCellMar>
         </w:tblPrEx>
         <w:trPr>
           <w:tblHeader/>
@@ -684,6 +678,12 @@
             <w:insideH w:val="single" w:color="auto" w:sz="4" w:space="0"/>
             <w:insideV w:val="single" w:color="auto" w:sz="4" w:space="0"/>
           </w:tblBorders>
+          <w:tblCellMar>
+            <w:top w:w="0" w:type="dxa"/>
+            <w:left w:w="108" w:type="dxa"/>
+            <w:bottom w:w="0" w:type="dxa"/>
+            <w:right w:w="108" w:type="dxa"/>
+          </w:tblCellMar>
         </w:tblPrEx>
         <w:trPr>
           <w:tblHeader/>
@@ -831,11 +831,8 @@
             <w:tcW w:w="2074" w:type="dxa"/>
           </w:tcPr>
           <w:p>
-            <w:pPr>
-              <w:spacing w:after="0" w:line="240" w:lineRule="auto"/>
-            </w:pPr>
-            <w:r>
-              <w:t>Receive/record referral and supporting information</w:t>
+            <w:r>
+              <w:t>Receive, record and externally validate referral reference and supporting information</w:t>
             </w:r>
           </w:p>
         </w:tc>
@@ -2875,14 +2872,14 @@
         </w:tblCellMar>
       </w:tblPr>
       <w:tblGrid>
-        <w:gridCol w:w="480"/>
-        <w:gridCol w:w="2413"/>
-        <w:gridCol w:w="714"/>
-        <w:gridCol w:w="830"/>
-        <w:gridCol w:w="939"/>
-        <w:gridCol w:w="1261"/>
-        <w:gridCol w:w="2727"/>
-        <w:gridCol w:w="1220"/>
+        <w:gridCol w:w="472"/>
+        <w:gridCol w:w="2347"/>
+        <w:gridCol w:w="965"/>
+        <w:gridCol w:w="811"/>
+        <w:gridCol w:w="917"/>
+        <w:gridCol w:w="1230"/>
+        <w:gridCol w:w="2652"/>
+        <w:gridCol w:w="1190"/>
       </w:tblGrid>
       <w:tr>
         <w:tblPrEx>
@@ -3381,7 +3378,14 @@
               <w:spacing w:after="0" w:line="240" w:lineRule="auto"/>
             </w:pPr>
             <w:r>
-              <w:t>7h</w:t>
+              <w:rPr>
+                <w:rFonts w:hint="eastAsia" w:eastAsia="宋体"/>
+                <w:lang w:val="en-US" w:eastAsia="zh-CN"/>
+              </w:rPr>
+              <w:t>1</w:t>
+            </w:r>
+            <w:r>
+              <w:t>h</w:t>
             </w:r>
           </w:p>
         </w:tc>
@@ -3506,7 +3510,14 @@
               <w:spacing w:after="0" w:line="240" w:lineRule="auto"/>
             </w:pPr>
             <w:r>
-              <w:t>7h</w:t>
+              <w:rPr>
+                <w:rFonts w:hint="eastAsia" w:eastAsia="宋体"/>
+                <w:lang w:val="en-US" w:eastAsia="zh-CN"/>
+              </w:rPr>
+              <w:t>1</w:t>
+            </w:r>
+            <w:r>
+              <w:t>h</w:t>
             </w:r>
           </w:p>
         </w:tc>
@@ -3631,7 +3642,14 @@
               <w:spacing w:after="0" w:line="240" w:lineRule="auto"/>
             </w:pPr>
             <w:r>
-              <w:t>7h</w:t>
+              <w:rPr>
+                <w:rFonts w:hint="eastAsia" w:eastAsia="宋体"/>
+                <w:lang w:val="en-US" w:eastAsia="zh-CN"/>
+              </w:rPr>
+              <w:t>1</w:t>
+            </w:r>
+            <w:r>
+              <w:t>h</w:t>
             </w:r>
           </w:p>
         </w:tc>
@@ -3756,7 +3774,14 @@
               <w:spacing w:after="0" w:line="240" w:lineRule="auto"/>
             </w:pPr>
             <w:r>
-              <w:t>6h</w:t>
+              <w:rPr>
+                <w:rFonts w:hint="eastAsia" w:eastAsia="宋体"/>
+                <w:lang w:val="en-US" w:eastAsia="zh-CN"/>
+              </w:rPr>
+              <w:t>1</w:t>
+            </w:r>
+            <w:r>
+              <w:t>h</w:t>
             </w:r>
           </w:p>
         </w:tc>
@@ -3851,11 +3876,8 @@
             <w:tcW w:w="1296" w:type="dxa"/>
           </w:tcPr>
           <w:p>
-            <w:pPr>
-              <w:spacing w:after="0" w:line="240" w:lineRule="auto"/>
-            </w:pPr>
-            <w:r>
-              <w:t>DENG</w:t>
+            <w:r>
+              <w:t>Referral Forms + external referral-validation worker</w:t>
             </w:r>
           </w:p>
         </w:tc>
@@ -3881,7 +3903,14 @@
               <w:spacing w:after="0" w:line="240" w:lineRule="auto"/>
             </w:pPr>
             <w:r>
-              <w:t>4h</w:t>
+              <w:rPr>
+                <w:rFonts w:hint="eastAsia" w:eastAsia="宋体"/>
+                <w:lang w:val="en-US" w:eastAsia="zh-CN"/>
+              </w:rPr>
+              <w:t>1</w:t>
+            </w:r>
+            <w:r>
+              <w:t>h</w:t>
             </w:r>
           </w:p>
         </w:tc>
@@ -3903,11 +3932,8 @@
             <w:tcW w:w="1296" w:type="dxa"/>
           </w:tcPr>
           <w:p>
-            <w:pPr>
-              <w:spacing w:after="0" w:line="240" w:lineRule="auto"/>
-            </w:pPr>
-            <w:r>
-              <w:t>Forms bound to user tasks</w:t>
+            <w:r>
+              <w:t>Forms bound; validate-referral-reference worker present</w:t>
             </w:r>
           </w:p>
         </w:tc>
@@ -4006,7 +4032,14 @@
               <w:spacing w:after="0" w:line="240" w:lineRule="auto"/>
             </w:pPr>
             <w:r>
-              <w:t>6h</w:t>
+              <w:rPr>
+                <w:rFonts w:hint="eastAsia" w:eastAsia="宋体"/>
+                <w:lang w:val="en-US" w:eastAsia="zh-CN"/>
+              </w:rPr>
+              <w:t>1</w:t>
+            </w:r>
+            <w:r>
+              <w:t>h</w:t>
             </w:r>
           </w:p>
         </w:tc>
@@ -4131,7 +4164,14 @@
               <w:spacing w:after="0" w:line="240" w:lineRule="auto"/>
             </w:pPr>
             <w:r>
-              <w:t>5h</w:t>
+              <w:rPr>
+                <w:rFonts w:hint="eastAsia" w:eastAsia="宋体"/>
+                <w:lang w:val="en-US" w:eastAsia="zh-CN"/>
+              </w:rPr>
+              <w:t>1</w:t>
+            </w:r>
+            <w:r>
+              <w:t>h</w:t>
             </w:r>
           </w:p>
         </w:tc>
@@ -4256,7 +4296,14 @@
               <w:spacing w:after="0" w:line="240" w:lineRule="auto"/>
             </w:pPr>
             <w:r>
-              <w:t>6h</w:t>
+              <w:rPr>
+                <w:rFonts w:hint="eastAsia" w:eastAsia="宋体"/>
+                <w:lang w:val="en-US" w:eastAsia="zh-CN"/>
+              </w:rPr>
+              <w:t>1</w:t>
+            </w:r>
+            <w:r>
+              <w:t>h</w:t>
             </w:r>
           </w:p>
         </w:tc>
@@ -4381,7 +4428,14 @@
               <w:spacing w:after="0" w:line="240" w:lineRule="auto"/>
             </w:pPr>
             <w:r>
-              <w:t>6h</w:t>
+              <w:rPr>
+                <w:rFonts w:hint="eastAsia" w:eastAsia="宋体"/>
+                <w:lang w:val="en-US" w:eastAsia="zh-CN"/>
+              </w:rPr>
+              <w:t>1</w:t>
+            </w:r>
+            <w:r>
+              <w:t>h</w:t>
             </w:r>
           </w:p>
         </w:tc>
@@ -4506,7 +4560,14 @@
               <w:spacing w:after="0" w:line="240" w:lineRule="auto"/>
             </w:pPr>
             <w:r>
-              <w:t>2h</w:t>
+              <w:rPr>
+                <w:rFonts w:hint="eastAsia" w:eastAsia="宋体"/>
+                <w:lang w:val="en-US" w:eastAsia="zh-CN"/>
+              </w:rPr>
+              <w:t>1</w:t>
+            </w:r>
+            <w:r>
+              <w:t>h</w:t>
             </w:r>
           </w:p>
         </w:tc>
@@ -4631,7 +4692,14 @@
               <w:spacing w:after="0" w:line="240" w:lineRule="auto"/>
             </w:pPr>
             <w:r>
-              <w:t>2h</w:t>
+              <w:rPr>
+                <w:rFonts w:hint="eastAsia" w:eastAsia="宋体"/>
+                <w:lang w:val="en-US" w:eastAsia="zh-CN"/>
+              </w:rPr>
+              <w:t>1</w:t>
+            </w:r>
+            <w:r>
+              <w:t>h</w:t>
             </w:r>
           </w:p>
         </w:tc>
@@ -4653,11 +4721,8 @@
             <w:tcW w:w="1296" w:type="dxa"/>
           </w:tcPr>
           <w:p>
-            <w:pPr>
-              <w:spacing w:after="0" w:line="240" w:lineRule="auto"/>
-            </w:pPr>
-            <w:r>
-              <w:t>11 local component tests compile; execute in a Maven-enabled environment</w:t>
+            <w:r>
+              <w:t>12 local component tests compile and pass in Maven</w:t>
             </w:r>
           </w:p>
         </w:tc>
@@ -4666,11 +4731,8 @@
             <w:tcW w:w="1296" w:type="dxa"/>
           </w:tcPr>
           <w:p>
-            <w:pPr>
-              <w:spacing w:after="0" w:line="240" w:lineRule="auto"/>
-            </w:pPr>
-            <w:r>
-              <w:t>Ready to execute</w:t>
+            <w:r>
+              <w:t>Done</w:t>
             </w:r>
           </w:p>
         </w:tc>
@@ -4756,7 +4818,16 @@
               <w:spacing w:after="0" w:line="240" w:lineRule="auto"/>
             </w:pPr>
             <w:r>
-              <w:t>4h</w:t>
+              <w:rPr>
+                <w:rFonts w:hint="eastAsia" w:eastAsia="宋体"/>
+                <w:lang w:val="en-US" w:eastAsia="zh-CN"/>
+              </w:rPr>
+              <w:t>1</w:t>
+            </w:r>
+            <w:bookmarkStart w:id="0" w:name="_GoBack"/>
+            <w:bookmarkEnd w:id="0"/>
+            <w:r>
+              <w:t>h</w:t>
             </w:r>
           </w:p>
         </w:tc>
@@ -4854,6 +4925,12 @@
             <w:insideH w:val="single" w:color="auto" w:sz="4" w:space="0"/>
             <w:insideV w:val="single" w:color="auto" w:sz="4" w:space="0"/>
           </w:tblBorders>
+          <w:tblCellMar>
+            <w:top w:w="0" w:type="dxa"/>
+            <w:left w:w="108" w:type="dxa"/>
+            <w:bottom w:w="0" w:type="dxa"/>
+            <w:right w:w="108" w:type="dxa"/>
+          </w:tblCellMar>
         </w:tblPrEx>
         <w:trPr>
           <w:tblHeader/>
@@ -5650,8 +5727,6 @@
         </w:rPr>
         <w:t>7</w:t>
       </w:r>
-      <w:bookmarkStart w:id="0" w:name="_GoBack"/>
-      <w:bookmarkEnd w:id="0"/>
       <w:r>
         <w:t>. Detailed Test Plan</w:t>
       </w:r>
@@ -5694,6 +5769,12 @@
             <w:insideH w:val="single" w:color="auto" w:sz="4" w:space="0"/>
             <w:insideV w:val="single" w:color="auto" w:sz="4" w:space="0"/>
           </w:tblBorders>
+          <w:tblCellMar>
+            <w:top w:w="0" w:type="dxa"/>
+            <w:left w:w="108" w:type="dxa"/>
+            <w:bottom w:w="0" w:type="dxa"/>
+            <w:right w:w="108" w:type="dxa"/>
+          </w:tblCellMar>
         </w:tblPrEx>
         <w:trPr>
           <w:tblHeader/>
@@ -5841,37 +5922,28 @@
             <w:tcW w:w="2074" w:type="dxa"/>
           </w:tcPr>
           <w:p>
-            <w:pPr>
-              <w:spacing w:after="0" w:line="240" w:lineRule="auto"/>
-            </w:pPr>
-            <w:r>
-              <w:t>Complete referral</w:t>
-            </w:r>
-          </w:p>
-        </w:tc>
-        <w:tc>
-          <w:tcPr>
-            <w:tcW w:w="2074" w:type="dxa"/>
-          </w:tcPr>
-          <w:p>
-            <w:pPr>
-              <w:spacing w:after="0" w:line="240" w:lineRule="auto"/>
-            </w:pPr>
-            <w:r>
-              <w:t>informationComplete=true</w:t>
-            </w:r>
-          </w:p>
-        </w:tc>
-        <w:tc>
-          <w:tcPr>
-            <w:tcW w:w="2074" w:type="dxa"/>
-          </w:tcPr>
-          <w:p>
-            <w:pPr>
-              <w:spacing w:after="0" w:line="240" w:lineRule="auto"/>
-            </w:pPr>
-            <w:r>
-              <w:t>Consultant review becomes available</w:t>
+            <w:r>
+              <w:t>Complete referral and valid external reference</w:t>
+            </w:r>
+          </w:p>
+        </w:tc>
+        <w:tc>
+          <w:tcPr>
+            <w:tcW w:w="2074" w:type="dxa"/>
+          </w:tcPr>
+          <w:p>
+            <w:r>
+              <w:t>informationComplete=true; requestedReferralReferenceValid=true</w:t>
+            </w:r>
+          </w:p>
+        </w:tc>
+        <w:tc>
+          <w:tcPr>
+            <w:tcW w:w="2074" w:type="dxa"/>
+          </w:tcPr>
+          <w:p>
+            <w:r>
+              <w:t>Referral validation worker returns VALID; consultant review becomes available</w:t>
             </w:r>
           </w:p>
         </w:tc>
@@ -9394,7 +9466,7 @@
     <w:lsdException w:uiPriority="99" w:name="Normal Indent"/>
     <w:lsdException w:uiPriority="99" w:name="footnote text"/>
     <w:lsdException w:uiPriority="99" w:name="annotation text"/>
-    <w:lsdException w:uiPriority="99" w:semiHidden="0" w:name="header"/>
+    <w:lsdException w:qFormat="1" w:uiPriority="99" w:semiHidden="0" w:name="header"/>
     <w:lsdException w:uiPriority="99" w:semiHidden="0" w:name="footer"/>
     <w:lsdException w:uiPriority="99" w:name="index heading"/>
     <w:lsdException w:qFormat="1" w:uiPriority="35" w:name="caption"/>
@@ -9408,20 +9480,20 @@
     <w:lsdException w:uiPriority="99" w:name="endnote reference"/>
     <w:lsdException w:uiPriority="99" w:name="endnote text"/>
     <w:lsdException w:uiPriority="99" w:name="table of authorities"/>
-    <w:lsdException w:uiPriority="99" w:semiHidden="0" w:name="macro"/>
+    <w:lsdException w:qFormat="1" w:uiPriority="99" w:semiHidden="0" w:name="macro"/>
     <w:lsdException w:uiPriority="99" w:name="toa heading"/>
     <w:lsdException w:uiPriority="99" w:semiHidden="0" w:name="List"/>
     <w:lsdException w:uiPriority="99" w:semiHidden="0" w:name="List Bullet"/>
     <w:lsdException w:uiPriority="99" w:semiHidden="0" w:name="List Number"/>
-    <w:lsdException w:uiPriority="99" w:semiHidden="0" w:name="List 2"/>
+    <w:lsdException w:qFormat="1" w:uiPriority="99" w:semiHidden="0" w:name="List 2"/>
     <w:lsdException w:uiPriority="99" w:semiHidden="0" w:name="List 3"/>
     <w:lsdException w:uiPriority="99" w:name="List 4"/>
     <w:lsdException w:uiPriority="99" w:name="List 5"/>
-    <w:lsdException w:uiPriority="99" w:semiHidden="0" w:name="List Bullet 2"/>
+    <w:lsdException w:qFormat="1" w:uiPriority="99" w:semiHidden="0" w:name="List Bullet 2"/>
     <w:lsdException w:uiPriority="99" w:semiHidden="0" w:name="List Bullet 3"/>
     <w:lsdException w:uiPriority="99" w:name="List Bullet 4"/>
     <w:lsdException w:uiPriority="99" w:name="List Bullet 5"/>
-    <w:lsdException w:uiPriority="99" w:semiHidden="0" w:name="List Number 2"/>
+    <w:lsdException w:qFormat="1" w:uiPriority="99" w:semiHidden="0" w:name="List Number 2"/>
     <w:lsdException w:uiPriority="99" w:semiHidden="0" w:name="List Number 3"/>
     <w:lsdException w:uiPriority="99" w:name="List Number 4"/>
     <w:lsdException w:uiPriority="99" w:name="List Number 5"/>
@@ -9466,7 +9538,7 @@
     <w:lsdException w:uiPriority="99" w:name="HTML Sample"/>
     <w:lsdException w:uiPriority="99" w:name="HTML Typewriter"/>
     <w:lsdException w:uiPriority="99" w:name="HTML Variable"/>
-    <w:lsdException w:uiPriority="99" w:name="Normal Table"/>
+    <w:lsdException w:qFormat="1" w:uiPriority="99" w:name="Normal Table"/>
     <w:lsdException w:uiPriority="99" w:name="annotation subject"/>
     <w:lsdException w:uiPriority="99" w:name="Table Simple 1"/>
     <w:lsdException w:uiPriority="99" w:name="Table Simple 2"/>
@@ -9531,8 +9603,8 @@
     <w:lsdException w:unhideWhenUsed="0" w:uiPriority="60" w:semiHidden="0" w:name="Light Shading Accent 1"/>
     <w:lsdException w:qFormat="1" w:unhideWhenUsed="0" w:uiPriority="61" w:semiHidden="0" w:name="Light List Accent 1"/>
     <w:lsdException w:unhideWhenUsed="0" w:uiPriority="62" w:semiHidden="0" w:name="Light Grid Accent 1"/>
-    <w:lsdException w:unhideWhenUsed="0" w:uiPriority="63" w:semiHidden="0" w:name="Medium Shading 1 Accent 1"/>
-    <w:lsdException w:unhideWhenUsed="0" w:uiPriority="64" w:semiHidden="0" w:name="Medium Shading 2 Accent 1"/>
+    <w:lsdException w:qFormat="1" w:unhideWhenUsed="0" w:uiPriority="63" w:semiHidden="0" w:name="Medium Shading 1 Accent 1"/>
+    <w:lsdException w:qFormat="1" w:unhideWhenUsed="0" w:uiPriority="64" w:semiHidden="0" w:name="Medium Shading 2 Accent 1"/>
     <w:lsdException w:unhideWhenUsed="0" w:uiPriority="65" w:semiHidden="0" w:name="Medium List 1 Accent 1"/>
     <w:lsdException w:qFormat="1" w:unhideWhenUsed="0" w:uiPriority="34" w:semiHidden="0" w:name="List Paragraph"/>
     <w:lsdException w:qFormat="1" w:unhideWhenUsed="0" w:uiPriority="29" w:semiHidden="0" w:name="Quote"/>
@@ -9548,9 +9620,9 @@
     <w:lsdException w:unhideWhenUsed="0" w:uiPriority="60" w:semiHidden="0" w:name="Light Shading Accent 2"/>
     <w:lsdException w:qFormat="1" w:unhideWhenUsed="0" w:uiPriority="61" w:semiHidden="0" w:name="Light List Accent 2"/>
     <w:lsdException w:unhideWhenUsed="0" w:uiPriority="62" w:semiHidden="0" w:name="Light Grid Accent 2"/>
-    <w:lsdException w:unhideWhenUsed="0" w:uiPriority="63" w:semiHidden="0" w:name="Medium Shading 1 Accent 2"/>
+    <w:lsdException w:qFormat="1" w:unhideWhenUsed="0" w:uiPriority="63" w:semiHidden="0" w:name="Medium Shading 1 Accent 2"/>
     <w:lsdException w:unhideWhenUsed="0" w:uiPriority="64" w:semiHidden="0" w:name="Medium Shading 2 Accent 2"/>
-    <w:lsdException w:unhideWhenUsed="0" w:uiPriority="65" w:semiHidden="0" w:name="Medium List 1 Accent 2"/>
+    <w:lsdException w:qFormat="1" w:unhideWhenUsed="0" w:uiPriority="65" w:semiHidden="0" w:name="Medium List 1 Accent 2"/>
     <w:lsdException w:unhideWhenUsed="0" w:uiPriority="66" w:semiHidden="0" w:name="Medium List 2 Accent 2"/>
     <w:lsdException w:unhideWhenUsed="0" w:uiPriority="67" w:semiHidden="0" w:name="Medium Grid 1 Accent 2"/>
     <w:lsdException w:unhideWhenUsed="0" w:uiPriority="68" w:semiHidden="0" w:name="Medium Grid 2 Accent 2"/>
@@ -9559,7 +9631,7 @@
     <w:lsdException w:unhideWhenUsed="0" w:uiPriority="71" w:semiHidden="0" w:name="Colorful Shading Accent 2"/>
     <w:lsdException w:unhideWhenUsed="0" w:uiPriority="72" w:semiHidden="0" w:name="Colorful List Accent 2"/>
     <w:lsdException w:qFormat="1" w:unhideWhenUsed="0" w:uiPriority="73" w:semiHidden="0" w:name="Colorful Grid Accent 2"/>
-    <w:lsdException w:unhideWhenUsed="0" w:uiPriority="60" w:semiHidden="0" w:name="Light Shading Accent 3"/>
+    <w:lsdException w:qFormat="1" w:unhideWhenUsed="0" w:uiPriority="60" w:semiHidden="0" w:name="Light Shading Accent 3"/>
     <w:lsdException w:unhideWhenUsed="0" w:uiPriority="61" w:semiHidden="0" w:name="Light List Accent 3"/>
     <w:lsdException w:unhideWhenUsed="0" w:uiPriority="62" w:semiHidden="0" w:name="Light Grid Accent 3"/>
     <w:lsdException w:unhideWhenUsed="0" w:uiPriority="63" w:semiHidden="0" w:name="Medium Shading 1 Accent 3"/>
@@ -9574,10 +9646,10 @@
     <w:lsdException w:unhideWhenUsed="0" w:uiPriority="72" w:semiHidden="0" w:name="Colorful List Accent 3"/>
     <w:lsdException w:unhideWhenUsed="0" w:uiPriority="73" w:semiHidden="0" w:name="Colorful Grid Accent 3"/>
     <w:lsdException w:qFormat="1" w:unhideWhenUsed="0" w:uiPriority="60" w:semiHidden="0" w:name="Light Shading Accent 4"/>
-    <w:lsdException w:unhideWhenUsed="0" w:uiPriority="61" w:semiHidden="0" w:name="Light List Accent 4"/>
+    <w:lsdException w:qFormat="1" w:unhideWhenUsed="0" w:uiPriority="61" w:semiHidden="0" w:name="Light List Accent 4"/>
     <w:lsdException w:unhideWhenUsed="0" w:uiPriority="62" w:semiHidden="0" w:name="Light Grid Accent 4"/>
     <w:lsdException w:unhideWhenUsed="0" w:uiPriority="63" w:semiHidden="0" w:name="Medium Shading 1 Accent 4"/>
-    <w:lsdException w:unhideWhenUsed="0" w:uiPriority="64" w:semiHidden="0" w:name="Medium Shading 2 Accent 4"/>
+    <w:lsdException w:qFormat="1" w:unhideWhenUsed="0" w:uiPriority="64" w:semiHidden="0" w:name="Medium Shading 2 Accent 4"/>
     <w:lsdException w:unhideWhenUsed="0" w:uiPriority="65" w:semiHidden="0" w:name="Medium List 1 Accent 4"/>
     <w:lsdException w:qFormat="1" w:unhideWhenUsed="0" w:uiPriority="66" w:semiHidden="0" w:name="Medium List 2 Accent 4"/>
     <w:lsdException w:unhideWhenUsed="0" w:uiPriority="67" w:semiHidden="0" w:name="Medium Grid 1 Accent 4"/>
@@ -9591,7 +9663,7 @@
     <w:lsdException w:unhideWhenUsed="0" w:uiPriority="61" w:semiHidden="0" w:name="Light List Accent 5"/>
     <w:lsdException w:unhideWhenUsed="0" w:uiPriority="62" w:semiHidden="0" w:name="Light Grid Accent 5"/>
     <w:lsdException w:unhideWhenUsed="0" w:uiPriority="63" w:semiHidden="0" w:name="Medium Shading 1 Accent 5"/>
-    <w:lsdException w:unhideWhenUsed="0" w:uiPriority="64" w:semiHidden="0" w:name="Medium Shading 2 Accent 5"/>
+    <w:lsdException w:qFormat="1" w:unhideWhenUsed="0" w:uiPriority="64" w:semiHidden="0" w:name="Medium Shading 2 Accent 5"/>
     <w:lsdException w:unhideWhenUsed="0" w:uiPriority="65" w:semiHidden="0" w:name="Medium List 1 Accent 5"/>
     <w:lsdException w:unhideWhenUsed="0" w:uiPriority="66" w:semiHidden="0" w:name="Medium List 2 Accent 5"/>
     <w:lsdException w:unhideWhenUsed="0" w:uiPriority="67" w:semiHidden="0" w:name="Medium Grid 1 Accent 5"/>
@@ -9602,9 +9674,9 @@
     <w:lsdException w:unhideWhenUsed="0" w:uiPriority="72" w:semiHidden="0" w:name="Colorful List Accent 5"/>
     <w:lsdException w:unhideWhenUsed="0" w:uiPriority="73" w:semiHidden="0" w:name="Colorful Grid Accent 5"/>
     <w:lsdException w:unhideWhenUsed="0" w:uiPriority="60" w:semiHidden="0" w:name="Light Shading Accent 6"/>
-    <w:lsdException w:unhideWhenUsed="0" w:uiPriority="61" w:semiHidden="0" w:name="Light List Accent 6"/>
+    <w:lsdException w:qFormat="1" w:unhideWhenUsed="0" w:uiPriority="61" w:semiHidden="0" w:name="Light List Accent 6"/>
     <w:lsdException w:unhideWhenUsed="0" w:uiPriority="62" w:semiHidden="0" w:name="Light Grid Accent 6"/>
-    <w:lsdException w:unhideWhenUsed="0" w:uiPriority="63" w:semiHidden="0" w:name="Medium Shading 1 Accent 6"/>
+    <w:lsdException w:qFormat="1" w:unhideWhenUsed="0" w:uiPriority="63" w:semiHidden="0" w:name="Medium Shading 1 Accent 6"/>
     <w:lsdException w:qFormat="1" w:unhideWhenUsed="0" w:uiPriority="64" w:semiHidden="0" w:name="Medium Shading 2 Accent 6"/>
     <w:lsdException w:unhideWhenUsed="0" w:uiPriority="65" w:semiHidden="0" w:name="Medium List 1 Accent 6"/>
     <w:lsdException w:unhideWhenUsed="0" w:uiPriority="66" w:semiHidden="0" w:name="Medium List 2 Accent 6"/>
@@ -9876,6 +9948,7 @@
     <w:name w:val="Normal Table"/>
     <w:semiHidden/>
     <w:unhideWhenUsed/>
+    <w:qFormat/>
     <w:uiPriority w:val="99"/>
     <w:tblPr>
       <w:tblCellMar>
@@ -9890,6 +9963,7 @@
     <w:name w:val="macro"/>
     <w:link w:val="147"/>
     <w:unhideWhenUsed/>
+    <w:qFormat/>
     <w:uiPriority w:val="99"/>
     <w:pPr>
       <w:tabs>
@@ -9924,6 +9998,7 @@
     <w:name w:val="List Number 2"/>
     <w:basedOn w:val="1"/>
     <w:unhideWhenUsed/>
+    <w:qFormat/>
     <w:uiPriority w:val="99"/>
     <w:pPr>
       <w:numPr>
@@ -10038,6 +10113,7 @@
     <w:name w:val="List 2"/>
     <w:basedOn w:val="1"/>
     <w:unhideWhenUsed/>
+    <w:qFormat/>
     <w:uiPriority w:val="99"/>
     <w:pPr>
       <w:ind w:left="720" w:hanging="360"/>
@@ -10059,6 +10135,7 @@
     <w:name w:val="List Bullet 2"/>
     <w:basedOn w:val="1"/>
     <w:unhideWhenUsed/>
+    <w:qFormat/>
     <w:uiPriority w:val="99"/>
     <w:pPr>
       <w:numPr>
@@ -10087,6 +10164,7 @@
     <w:basedOn w:val="1"/>
     <w:link w:val="135"/>
     <w:unhideWhenUsed/>
+    <w:qFormat/>
     <w:uiPriority w:val="99"/>
     <w:pPr>
       <w:tabs>
@@ -10508,6 +10586,7 @@
   <w:style w:type="table" w:styleId="37">
     <w:name w:val="Light Shading Accent 3"/>
     <w:basedOn w:val="32"/>
+    <w:qFormat/>
     <w:uiPriority w:val="60"/>
     <w:pPr>
       <w:spacing w:after="0" w:line="240" w:lineRule="auto"/>
@@ -11279,6 +11358,7 @@
   <w:style w:type="table" w:styleId="45">
     <w:name w:val="Light List Accent 4"/>
     <w:basedOn w:val="32"/>
+    <w:qFormat/>
     <w:uiPriority w:val="61"/>
     <w:pPr>
       <w:spacing w:after="0" w:line="240" w:lineRule="auto"/>
@@ -11465,6 +11545,7 @@
   <w:style w:type="table" w:styleId="47">
     <w:name w:val="Light List Accent 6"/>
     <w:basedOn w:val="32"/>
+    <w:qFormat/>
     <w:uiPriority w:val="61"/>
     <w:pPr>
       <w:spacing w:after="0" w:line="240" w:lineRule="auto"/>
@@ -12548,6 +12629,7 @@
   <w:style w:type="table" w:styleId="56">
     <w:name w:val="Medium Shading 1 Accent 1"/>
     <w:basedOn w:val="32"/>
+    <w:qFormat/>
     <w:uiPriority w:val="63"/>
     <w:pPr>
       <w:spacing w:after="0" w:line="240" w:lineRule="auto"/>
@@ -12655,6 +12737,7 @@
   <w:style w:type="table" w:styleId="57">
     <w:name w:val="Medium Shading 1 Accent 2"/>
     <w:basedOn w:val="32"/>
+    <w:qFormat/>
     <w:uiPriority w:val="63"/>
     <w:pPr>
       <w:spacing w:after="0" w:line="240" w:lineRule="auto"/>
@@ -13083,6 +13166,7 @@
   <w:style w:type="table" w:styleId="61">
     <w:name w:val="Medium Shading 1 Accent 6"/>
     <w:basedOn w:val="32"/>
+    <w:qFormat/>
     <w:uiPriority w:val="63"/>
     <w:pPr>
       <w:spacing w:after="0" w:line="240" w:lineRule="auto"/>
@@ -13355,6 +13439,7 @@
   <w:style w:type="table" w:styleId="63">
     <w:name w:val="Medium Shading 2 Accent 1"/>
     <w:basedOn w:val="32"/>
+    <w:qFormat/>
     <w:uiPriority w:val="64"/>
     <w:pPr>
       <w:spacing w:after="0" w:line="240" w:lineRule="auto"/>
@@ -13850,6 +13935,7 @@
   <w:style w:type="table" w:styleId="66">
     <w:name w:val="Medium Shading 2 Accent 4"/>
     <w:basedOn w:val="32"/>
+    <w:qFormat/>
     <w:uiPriority w:val="64"/>
     <w:pPr>
       <w:spacing w:after="0" w:line="240" w:lineRule="auto"/>
@@ -14015,6 +14101,7 @@
   <w:style w:type="table" w:styleId="67">
     <w:name w:val="Medium Shading 2 Accent 5"/>
     <w:basedOn w:val="32"/>
+    <w:qFormat/>
     <w:uiPriority w:val="64"/>
     <w:pPr>
       <w:spacing w:after="0" w:line="240" w:lineRule="auto"/>
@@ -14527,6 +14614,7 @@
   <w:style w:type="table" w:styleId="71">
     <w:name w:val="Medium List 1 Accent 2"/>
     <w:basedOn w:val="32"/>
+    <w:qFormat/>
     <w:uiPriority w:val="65"/>
     <w:pPr>
       <w:spacing w:after="0" w:line="240" w:lineRule="auto"/>

</xml_diff>